<commit_message>
fix: ajustar Fase 3 (botón Presentación con estilo y botón Revisar sobre la marcha) y Fase 4 (botón Resumen de vídeo directo sin podcast)
</commit_message>
<xml_diff>
--- a/CLASES/2. INTRODUCCION_NLM/FICHA_PRACTICA_SISTEMATIZADA_NOTEBOOKLM.docx
+++ b/CLASES/2. INTRODUCCION_NLM/FICHA_PRACTICA_SISTEMATIZADA_NOTEBOOKLM.docx
@@ -99,7 +99,7 @@
                 <w:color w:val="28323C"/>
                 <w:sz w:val="20"/>
               </w:rPr>
-              <w:t>Aprender a manejar Google NotebookLM de forma rigurosa y ordenada.</w:t>
+              <w:t>Aprender a manejar Google NotebookLM de forma rigurosa, visual y ordenada.</w:t>
             </w:r>
           </w:p>
           <w:p>
@@ -112,7 +112,7 @@
                 <w:color w:val="28323C"/>
                 <w:sz w:val="20"/>
               </w:rPr>
-              <w:t>Partiremos de 3 fuentes complementarias sobre un mismo acontecimiento histórico universal: La Llegada a la Luna (20 de julio de 1969).</w:t>
+              <w:t>Partiremos de 3 fuentes complementarias sobre La Llegada a la Luna (20 de julio de 1969): un recuerdo familiar (TXT), un informe histórico de la NASA (PDF) y un vídeo conmemorativo (YouTube).</w:t>
             </w:r>
           </w:p>
           <w:p>
@@ -125,7 +125,7 @@
                 <w:color w:val="28323C"/>
                 <w:sz w:val="20"/>
               </w:rPr>
-              <w:t>Descubriremos cómo NotebookLM resume automáticamente, cómo buscar datos con citas [1] en cada papel, cómo fijar notas en el corcho digital, cómo exprimir los 9 botones automáticos de Studio y cómo crear una presentación y un vídeo.</w:t>
+              <w:t>Descubriremos el resumen automático central, cómo hacer preguntas con citas [1] en cada papel, cómo fijar notas permanentes, cómo exprimir los botones de Studio, cómo crear una presentación con estilo y revisarla en vivo, y cómo generar un resumen de vídeo combinando las 3 fuentes.</w:t>
             </w:r>
           </w:p>
         </w:tc>
@@ -158,7 +158,7 @@
         <w:rPr>
           <w:color w:val="212529"/>
         </w:rPr>
-        <w:t xml:space="preserve">En la columna izquierda de NotebookLM («Fuentes»), pulsa el botón </w:t>
+        <w:t xml:space="preserve">En la columna izquierda («Fuentes»), pulsa </w:t>
       </w:r>
       <w:r>
         <w:rPr>
@@ -558,7 +558,7 @@
                 <w:color w:val="28323C"/>
                 <w:sz w:val="20"/>
               </w:rPr>
-              <w:t>NotebookLM es un archivador inteligente que SOLO lee las casillas que tengas activadas con el tick.</w:t>
+              <w:t>NotebookLM es un archivador inteligente que SOLO lee las fuentes que tengan la casilla marcada.</w:t>
             </w:r>
           </w:p>
           <w:p>
@@ -571,7 +571,7 @@
                 <w:color w:val="28323C"/>
                 <w:sz w:val="20"/>
               </w:rPr>
-              <w:t>Si dejas marcada una sola fuente, la IA 'olvidará' temporalmente las otras dos. ¡Esta es la clave para hacer análisis limpios e independientes!</w:t>
+              <w:t>Si dejas activada una sola fuente, la IA 'olvidará' temporalmente las otras dos. ¡Esta es la clave para hacer análisis individuales y limpios!</w:t>
             </w:r>
           </w:p>
         </w:tc>
@@ -714,7 +714,7 @@
                 <w:color w:val="28323C"/>
                 <w:sz w:val="20"/>
               </w:rPr>
-              <w:t>3. En la parte inferior sugiere varias preguntas recomendadas para romper el hielo.</w:t>
+              <w:t>3. En la parte inferior sugiere varias preguntas recomendadas para explorar los temas.</w:t>
             </w:r>
           </w:p>
         </w:tc>
@@ -847,13 +847,13 @@
         <w:rPr>
           <w:color w:val="212529"/>
         </w:rPr>
-        <w:t xml:space="preserve">Marca ahora las 3 fuentes a la vez [✔]. Vamos a hacer preguntas concretas para comprobar la mayor virtud de NotebookLM: </w:t>
+        <w:t xml:space="preserve">Marca ahora las 3 fuentes a la vez [✔]. Vamos a hacer preguntas concretas para comprobar </w:t>
       </w:r>
       <w:r>
         <w:rPr>
           <w:b/>
         </w:rPr>
-        <w:t>la cita que demuestra de dónde sale cada dato:</w:t>
+        <w:t>la cita numerada [1] que demuestra de dónde sale cada dato:</w:t>
       </w:r>
     </w:p>
     <w:p>
@@ -1080,13 +1080,7 @@
         <w:rPr>
           <w:color w:val="212529"/>
         </w:rPr>
-        <w:t xml:space="preserve">Ahora vamos a convertir a NotebookLM en una máquina de crear formatos. </w:t>
-      </w:r>
-      <w:r>
-        <w:rPr>
-          <w:b/>
-        </w:rPr>
-        <w:t>Sigue estos pasos con atención:</w:t>
+        <w:t>Ahora vamos a explorar la fábrica de contenidos de Studio. Sigue estos pasos:</w:t>
       </w:r>
     </w:p>
     <w:p>
@@ -1113,7 +1107,7 @@
         <w:t>ÚNICAMENTE el vídeo de YouTube [✔]</w:t>
       </w:r>
       <w:r>
-        <w:t>. De este modo, todo lo que generes se basará 100% en el vídeo.</w:t>
+        <w:t>. Así todo lo generado se basará 100% en el vídeo.</w:t>
       </w:r>
     </w:p>
     <w:p>
@@ -1131,7 +1125,7 @@
         <w:rPr>
           <w:color w:val="212529"/>
         </w:rPr>
-        <w:t>Ve pulsando UNO A UNO los 9 botones automáticos y observa el resultado en tu pantalla:</w:t>
+        <w:t>Ve pulsando UNO A UNO cada uno de los 9 botones automáticos y observa el resultado:</w:t>
       </w:r>
     </w:p>
     <w:tbl>
@@ -1240,7 +1234,7 @@
                 <w:color w:val="212529"/>
                 <w:sz w:val="17"/>
               </w:rPr>
-              <w:t>1. Resumen de audio 🎙️</w:t>
+              <w:t>1. Preguntas frecuentes (FAQ)</w:t>
             </w:r>
           </w:p>
         </w:tc>
@@ -1265,7 +1259,7 @@
                 <w:color w:val="212529"/>
                 <w:sz w:val="17"/>
               </w:rPr>
-              <w:t>[  ] Pulsa 'Generar' en Audio Overview</w:t>
+              <w:t>[  ] Pulsa 'Preguntas frecuentes'</w:t>
             </w:r>
           </w:p>
         </w:tc>
@@ -1290,7 +1284,7 @@
                 <w:color w:val="212529"/>
                 <w:sz w:val="17"/>
               </w:rPr>
-              <w:t>Un programa de radio tipo podcast con 2 periodistas en español debatiendo el vídeo de YouTube.</w:t>
+              <w:t>Un cuestionario con las dudas clave que resolvería alguien que ve el vídeo de la conmemoración.</w:t>
             </w:r>
           </w:p>
         </w:tc>
@@ -1318,7 +1312,7 @@
                 <w:color w:val="212529"/>
                 <w:sz w:val="17"/>
               </w:rPr>
-              <w:t>2. Preguntas frecuentes (FAQ)</w:t>
+              <w:t>2. Guía de estudio 📚</w:t>
             </w:r>
           </w:p>
         </w:tc>
@@ -1343,7 +1337,7 @@
                 <w:color w:val="212529"/>
                 <w:sz w:val="17"/>
               </w:rPr>
-              <w:t>[  ] Pulsa 'Preguntas frecuentes'</w:t>
+              <w:t>[  ] Pulsa 'Guía de estudio'</w:t>
             </w:r>
           </w:p>
         </w:tc>
@@ -1368,7 +1362,7 @@
                 <w:color w:val="212529"/>
                 <w:sz w:val="17"/>
               </w:rPr>
-              <w:t>Un cuestionario con las dudas clave que resolvería alguien que ve el vídeo de la conmemoración.</w:t>
+              <w:t>Un temario pedagógico estructurado con preguntas de repaso y términos clave explicados.</w:t>
             </w:r>
           </w:p>
         </w:tc>
@@ -1396,7 +1390,7 @@
                 <w:color w:val="212529"/>
                 <w:sz w:val="17"/>
               </w:rPr>
-              <w:t>3. Guía de estudio 📚</w:t>
+              <w:t>3. Cronología / Línea de tiempo ⏱️</w:t>
             </w:r>
           </w:p>
         </w:tc>
@@ -1421,7 +1415,7 @@
                 <w:color w:val="212529"/>
                 <w:sz w:val="17"/>
               </w:rPr>
-              <w:t>[  ] Pulsa 'Guía de estudio'</w:t>
+              <w:t>[  ] Pulsa 'Línea de tiempo'</w:t>
             </w:r>
           </w:p>
         </w:tc>
@@ -1446,7 +1440,7 @@
                 <w:color w:val="212529"/>
                 <w:sz w:val="17"/>
               </w:rPr>
-              <w:t>Un temario pedagógico estructurado con preguntas de repaso y términos clave explicados.</w:t>
+              <w:t>Una lista cronológica con las fechas y años clave mencionados en el reportaje.</w:t>
             </w:r>
           </w:p>
         </w:tc>
@@ -1474,7 +1468,7 @@
                 <w:color w:val="212529"/>
                 <w:sz w:val="17"/>
               </w:rPr>
-              <w:t>4. Cronología / Línea de tiempo ⏱️</w:t>
+              <w:t>4. Documento informativo 📄</w:t>
             </w:r>
           </w:p>
         </w:tc>
@@ -1499,7 +1493,7 @@
                 <w:color w:val="212529"/>
                 <w:sz w:val="17"/>
               </w:rPr>
-              <w:t>[  ] Pulsa 'Línea de tiempo'</w:t>
+              <w:t>[  ] Pulsa 'Documento informativo'</w:t>
             </w:r>
           </w:p>
         </w:tc>
@@ -1524,7 +1518,7 @@
                 <w:color w:val="212529"/>
                 <w:sz w:val="17"/>
               </w:rPr>
-              <w:t>Una lista cronológica con las fechas y años clave mencionados en el reportaje.</w:t>
+              <w:t>Un informe formal y ejecutivo (Briefing) listo para imprimir o enviar por correo.</w:t>
             </w:r>
           </w:p>
         </w:tc>
@@ -1552,7 +1546,7 @@
                 <w:color w:val="212529"/>
                 <w:sz w:val="17"/>
               </w:rPr>
-              <w:t>5. Documento informativo 📄</w:t>
+              <w:t>5. Tabla de contenidos 📑</w:t>
             </w:r>
           </w:p>
         </w:tc>
@@ -1577,7 +1571,7 @@
                 <w:color w:val="212529"/>
                 <w:sz w:val="17"/>
               </w:rPr>
-              <w:t>[  ] Pulsa 'Documento informativo'</w:t>
+              <w:t>[  ] Pulsa 'Tabla de contenidos'</w:t>
             </w:r>
           </w:p>
         </w:tc>
@@ -1602,7 +1596,7 @@
                 <w:color w:val="212529"/>
                 <w:sz w:val="17"/>
               </w:rPr>
-              <w:t>Un informe formal y ejecutivo (Briefing) listo para imprimir o enviar por correo.</w:t>
+              <w:t>Un índice estructurado con los capítulos y temas tratados a lo largo del vídeo.</w:t>
             </w:r>
           </w:p>
         </w:tc>
@@ -1630,7 +1624,7 @@
                 <w:color w:val="212529"/>
                 <w:sz w:val="17"/>
               </w:rPr>
-              <w:t>6. Tabla de contenidos 📑</w:t>
+              <w:t>6. Puntos clave / Ideas destacadas 💡</w:t>
             </w:r>
           </w:p>
         </w:tc>
@@ -1655,7 +1649,7 @@
                 <w:color w:val="212529"/>
                 <w:sz w:val="17"/>
               </w:rPr>
-              <w:t>[  ] Pulsa 'Tabla de contenidos'</w:t>
+              <w:t>[  ] Pulsa 'Puntos clave'</w:t>
             </w:r>
           </w:p>
         </w:tc>
@@ -1680,7 +1674,7 @@
                 <w:color w:val="212529"/>
                 <w:sz w:val="17"/>
               </w:rPr>
-              <w:t>Un índice estructurado con los capítulos y temas tratados a lo largo del vídeo.</w:t>
+              <w:t>Un decálogo con las perlas de información más importantes sintetizadas en viñetas.</w:t>
             </w:r>
           </w:p>
         </w:tc>
@@ -1708,7 +1702,7 @@
                 <w:color w:val="212529"/>
                 <w:sz w:val="17"/>
               </w:rPr>
-              <w:t>7. Puntos clave / Ideas destacadas 💡</w:t>
+              <w:t>7. Ensayo / Borrador narrativo ✍️</w:t>
             </w:r>
           </w:p>
         </w:tc>
@@ -1733,7 +1727,7 @@
                 <w:color w:val="212529"/>
                 <w:sz w:val="17"/>
               </w:rPr>
-              <w:t>[  ] Pulsa 'Puntos clave'</w:t>
+              <w:t>[  ] Pulsa 'Borrador / Ensayo'</w:t>
             </w:r>
           </w:p>
         </w:tc>
@@ -1758,7 +1752,7 @@
                 <w:color w:val="212529"/>
                 <w:sz w:val="17"/>
               </w:rPr>
-              <w:t>Un decálogo con las perlas de información más importantes sintetizadas en viñetas.</w:t>
+              <w:t>Una redacción continua y literaria que narra la trascendencia histórica del acontecimiento.</w:t>
             </w:r>
           </w:p>
         </w:tc>
@@ -1786,7 +1780,7 @@
                 <w:color w:val="212529"/>
                 <w:sz w:val="17"/>
               </w:rPr>
-              <w:t>8. Ensayo / Borrador narrativo ✍️</w:t>
+              <w:t>8. Resumen breve</w:t>
             </w:r>
           </w:p>
         </w:tc>
@@ -1811,7 +1805,7 @@
                 <w:color w:val="212529"/>
                 <w:sz w:val="17"/>
               </w:rPr>
-              <w:t>[  ] Pulsa 'Borrador / Ensayo'</w:t>
+              <w:t>[  ] Pulsa 'Resumen'</w:t>
             </w:r>
           </w:p>
         </w:tc>
@@ -1836,7 +1830,7 @@
                 <w:color w:val="212529"/>
                 <w:sz w:val="17"/>
               </w:rPr>
-              <w:t>Una redacción continua y literaria que narra la trascendencia histórica del acontecimiento.</w:t>
+              <w:t>Una síntesis rápida en un solo párrafo para entender la esencia del vídeo.</w:t>
             </w:r>
           </w:p>
         </w:tc>
@@ -1914,7 +1908,7 @@
                 <w:color w:val="212529"/>
                 <w:sz w:val="17"/>
               </w:rPr>
-              <w:t>Crea una nota propia en blanco para apuntar tus reflexiones (ej. 'Enseñar este vídeo a mis nietos').</w:t>
+              <w:t>Crea una nota propia en blanco para apuntar tus reflexiones (ej. 'Ver este vídeo con mis nietos').</w:t>
             </w:r>
           </w:p>
         </w:tc>
@@ -1936,7 +1930,7 @@
           <w:color w:val="0B2545"/>
           <w:sz w:val="28"/>
         </w:rPr>
-        <w:t>FASE 3: Creación de una Presentación y Revisión Iterativa (TXT + PDF)</w:t>
+        <w:t>FASE 3: El Botón de Presentación y Revisión en Vivo (TXT + PDF)</w:t>
       </w:r>
     </w:p>
     <w:p>
@@ -1947,18 +1941,12 @@
         <w:rPr>
           <w:color w:val="212529"/>
         </w:rPr>
-        <w:t xml:space="preserve">En la vida real nunca nos quedamos con el primer borrador que entrega la inteligencia artificial. </w:t>
-      </w:r>
-      <w:r>
-        <w:rPr>
-          <w:b/>
-        </w:rPr>
-        <w:t>Vamos a combinar el texto del recuerdo familiar con el PDF técnico para crear una presentación y luego perfeccionarla:</w:t>
+        <w:t>En esta fase no escribiremos en el chat. Utilizaremos directamente el botón de presentación de Studio para generar diapositivas con estilo propio y después revisarlas en vivo:</w:t>
       </w:r>
     </w:p>
     <w:p>
       <w:pPr>
-        <w:spacing w:after="60"/>
+        <w:spacing w:after="80"/>
         <w:ind w:left="288"/>
       </w:pPr>
       <w:r>
@@ -1980,7 +1968,7 @@
         <w:t>el TXT [✔] y el PDF [✔]</w:t>
       </w:r>
       <w:r>
-        <w:t>. Desmarca el vídeo de YouTube [ ].</w:t>
+        <w:t>. Deja desmarcado el vídeo de YouTube [ ].</w:t>
       </w:r>
     </w:p>
     <w:p>
@@ -1992,13 +1980,22 @@
         <w:rPr>
           <w:b/>
         </w:rPr>
-        <w:t xml:space="preserve">[  ] Paso 3.2: Generar el Guion de Diapositivas: </w:t>
+        <w:t xml:space="preserve">[  ] Paso 3.2: Pulsar el Botón «Presentación» y fijar el estilo visual: </w:t>
       </w:r>
       <w:r>
         <w:rPr>
           <w:color w:val="212529"/>
         </w:rPr>
-        <w:t>Escribe este prompt exacto en el chat:</w:t>
+        <w:t xml:space="preserve">En el panel lateral de Studio (a la derecha), pulsa directamente sobre el botón </w:t>
+      </w:r>
+      <w:r>
+        <w:rPr>
+          <w:b/>
+        </w:rPr>
+        <w:t>«Presentación»</w:t>
+      </w:r>
+      <w:r>
+        <w:t>. En la ventana o casilla de personalización que te ofrece NotebookLM para guiar la presentación, escribe este prompt de estilo visual y editorial:</w:t>
         <w:br/>
       </w:r>
       <w:r>
@@ -2006,7 +2003,7 @@
           <w:b/>
           <w:color w:val="0B2545"/>
         </w:rPr>
-        <w:t>👉 «Crea una estructura de presentación de 4 diapositivas titulada: 'Apolo 11: Entre la Ciencia y el Salón de Casa'. En cada diapositiva incluye: Título, 3 puntos clave y una frase textual extraída de los documentos.»</w:t>
+        <w:t>👉 «Crea una presentación con un estilo visual sobrio, elegante y de crónica documental histórica. Utiliza una paleta espacial limpia (azul marino profundo, gris grafito y blanco de alto contraste), con tipografía grande y muy legible para personas mayores. Estructura las diapositivas equilibrando el rigor técnico de la NASA con la emoción humana del recuerdo familiar en Madrid, incorporando frases textuales entrecomilladas y evitando totalmente ilustraciones infantiles, colores estridentes o estilos de fantasía.»</w:t>
       </w:r>
     </w:p>
     <w:p>
@@ -2018,21 +2015,22 @@
         <w:rPr>
           <w:b/>
         </w:rPr>
-        <w:t xml:space="preserve">[  ] Paso 3.3: La Revisión Crítica (Iteración Pedagógica): </w:t>
+        <w:t xml:space="preserve">[  ] Paso 3.3: Revisar la Presentación resultante con el Botón «Revisar»: </w:t>
       </w:r>
       <w:r>
         <w:rPr>
           <w:color w:val="212529"/>
         </w:rPr>
-        <w:t>Una vez que NotebookLM te muestre las 4 diapositivas, no te conformes. Pídele un ajuste exigente:</w:t>
-        <w:br/>
+        <w:t xml:space="preserve">Una vez generada la presentación en pantalla, entra en ella y pulsa el botón </w:t>
       </w:r>
       <w:r>
         <w:rPr>
           <w:b/>
-          <w:color w:val="0066A1"/>
         </w:rPr>
-        <w:t>👉 «Revisa la presentación: En la diapositiva 2, dale más emoción a las lágrimas del abuelo y al calor de aquella noche en Madrid. En la diapositiva 3, destaca con fuerza el orgullo de que Fresnedillas de la Oliva escuchara el alunizaje antes que la propia NASA en Houston.»</w:t>
+        <w:t>«Revisar»</w:t>
+      </w:r>
+      <w:r>
+        <w:t xml:space="preserve"> (o Editar/Ajustar). En este paso no usaremos un texto cerrado: realizaremos la revisión directamente sobre la marcha en clase con el profesor, probando ajustes en vivo según lo que queramos perfeccionar.</w:t>
       </w:r>
     </w:p>
     <w:tbl>
@@ -2074,7 +2072,7 @@
                 <w:color w:val="0066A1"/>
                 <w:sz w:val="22"/>
               </w:rPr>
-              <w:t>💡 LECCIÓN DE APRENDIZAJE: LA IA COMO COLABORADORA</w:t>
+              <w:t>💡 LA CLAVE DE LA REVISIÓN EN VIVO</w:t>
             </w:r>
           </w:p>
           <w:p>
@@ -2087,7 +2085,7 @@
                 <w:color w:val="28323C"/>
                 <w:sz w:val="20"/>
               </w:rPr>
-              <w:t>Fíjate en cómo NotebookLM reescribe y enriquece la diapositiva en segundos respetando tus documentos originales.</w:t>
+              <w:t>La inteligencia artificial ofrece un primer borrador excelente, pero el control pedagógico es siempre tuyo.</w:t>
             </w:r>
           </w:p>
           <w:p>
@@ -2100,7 +2098,7 @@
                 <w:color w:val="28323C"/>
                 <w:sz w:val="20"/>
               </w:rPr>
-              <w:t>Una vez revisada, pulsa 'Guardar en nota' para conservarla en Studio como tu presentación definitiva de clase.</w:t>
+              <w:t>Al pulsar el botón «Revisar» dentro de la misma presentación, puedes modificar cualquier diapositiva, añadir más énfasis a una frase del abuelo o pulir los datos técnicos al instante.</w:t>
             </w:r>
           </w:p>
         </w:tc>
@@ -2122,7 +2120,7 @@
           <w:color w:val="0B2545"/>
           <w:sz w:val="28"/>
         </w:rPr>
-        <w:t>FASE 4: El Gran Proyecto Final Multimedia (Las 3 Fuentes Juntas)</w:t>
+        <w:t>FASE 4: El Gran Resumen de Vídeo (Las 3 Fuentes Juntas)</w:t>
       </w:r>
     </w:p>
     <w:p>
@@ -2133,25 +2131,25 @@
         <w:rPr>
           <w:color w:val="212529"/>
         </w:rPr>
-        <w:t>El culmen del taller: poner a trabajar la emoción humana (TXT), el rigor histórico (PDF) y el impacto audiovisual (YouTube) a la vez.</w:t>
+        <w:t>El momento cumbre del taller: poner a trabajar la emoción humana (TXT), el rigor histórico (PDF) y el impacto audiovisual (YouTube) de forma totalmente automatizada en Studio.</w:t>
       </w:r>
     </w:p>
     <w:p>
       <w:pPr>
-        <w:spacing w:after="60"/>
+        <w:spacing w:after="80"/>
         <w:ind w:left="288"/>
       </w:pPr>
       <w:r>
         <w:rPr>
           <w:b/>
         </w:rPr>
-        <w:t xml:space="preserve">[  ] Paso 4.1: Selección Total: </w:t>
+        <w:t xml:space="preserve">[  ] Paso 4.1: Selección Total de Fuentes: </w:t>
       </w:r>
       <w:r>
         <w:rPr>
           <w:color w:val="212529"/>
         </w:rPr>
-        <w:t xml:space="preserve">Marca las </w:t>
+        <w:t xml:space="preserve">En la columna izquierda, marca las </w:t>
       </w:r>
       <w:r>
         <w:rPr>
@@ -2165,91 +2163,106 @@
     </w:p>
     <w:p>
       <w:pPr>
-        <w:spacing w:after="80"/>
+        <w:spacing w:after="120"/>
         <w:ind w:left="288"/>
       </w:pPr>
       <w:r>
         <w:rPr>
           <w:b/>
         </w:rPr>
-        <w:t xml:space="preserve">[  ] Paso 4.2: Crear el Guion para un Vídeo Documental: </w:t>
+        <w:t xml:space="preserve">[  ] Paso 4.2: Pulsar el Botón «Resumen de vídeo» en Studio (Sin prompts en el chat): </w:t>
       </w:r>
       <w:r>
         <w:rPr>
           <w:color w:val="212529"/>
         </w:rPr>
-        <w:t>Escribe este prompt en NotebookLM:</w:t>
-        <w:br/>
-      </w:r>
-      <w:r>
-        <w:rPr>
-          <w:b/>
-          <w:color w:val="0B2545"/>
-        </w:rPr>
-        <w:t>👉 «Actúa como guionista de documentales históricos. Combinando las 3 fuentes, escribe el guion de un vídeo de 2 minutos titulado 'La Noche en que Tocamos la Luna'. Divide el guion en 3 escenas: 1. El balcón abierto y la tele en Madrid, 2. La antena de Fresnedillas y el ordenador de 4 KB, 3. La reflexión 50 años después. Incluye voz en off y música sugerida.»</w:t>
-      </w:r>
-    </w:p>
-    <w:p>
-      <w:pPr>
-        <w:spacing w:after="80"/>
-        <w:ind w:left="288"/>
-      </w:pPr>
-      <w:r>
-        <w:rPr>
-          <w:b/>
-        </w:rPr>
-        <w:t xml:space="preserve">[  ] Paso 4.3: Llevar la Escena 1 a Vídeo Real con Gemini: </w:t>
-      </w:r>
-      <w:r>
-        <w:rPr>
-          <w:color w:val="212529"/>
-        </w:rPr>
-        <w:t xml:space="preserve">Copia la descripción de la primera escena de tu guion, abre </w:t>
+        <w:t xml:space="preserve">Dirígete al panel de Studio (a la derecha) y pulsa directamente sobre el botón </w:t>
       </w:r>
       <w:r>
         <w:rPr>
           <w:b/>
         </w:rPr>
-        <w:t>gemini.google.com</w:t>
+        <w:t>«Resumen de vídeo»</w:t>
       </w:r>
       <w:r>
-        <w:t xml:space="preserve"> en una pestaña nueva y genera tu clip de vídeo de 10 segundos con este prompt:</w:t>
-        <w:br/>
-      </w:r>
-      <w:r>
-        <w:rPr>
-          <w:b/>
-          <w:color w:val="B42814"/>
-        </w:rPr>
-        <w:t>🎬 «Crea un vídeo de 10 segundos: Plano cinematográfico realista en penumbra de un salón familiar de Madrid en la calurosa noche del 20 de julio de 1969. Una familia de varias generaciones y vecinos miran hipnotizados una televisión Telefunken en blanco y negro que emite las imágenes granuladas de Neil Armstrong pisando la Luna. Luz tenue azulada de la pantalla, balcón abierto con cortinas movidas por la brisa y lágrimas de emoción en un abuelo anciano.»</w:t>
+        <w:t>. No necesitas escribir ningún prompt en el chat ni añadir más instrucciones: simplemente pulsa el botón y observa cómo NotebookLM procesa e integra automáticamente las tres fuentes en una síntesis audiovisual.</w:t>
       </w:r>
     </w:p>
+    <w:tbl>
+      <w:tblPr>
+        <w:tblW w:type="auto" w:w="0"/>
+        <w:jc w:val="center"/>
+        <w:tblLayout w:type="fixed"/>
+        <w:tblLook w:firstColumn="1" w:firstRow="1" w:lastColumn="0" w:lastRow="0" w:noHBand="0" w:noVBand="1" w:val="04A0"/>
+      </w:tblPr>
+      <w:tblGrid>
+        <w:gridCol w:w="9360"/>
+      </w:tblGrid>
+      <w:tr>
+        <w:tc>
+          <w:tcPr>
+            <w:tcW w:type="dxa" w:w="9792"/>
+            <w:shd w:fill="E6FCF5"/>
+            <w:tcMar>
+              <w:top w:w="160" w:type="dxa"/>
+              <w:bottom w:w="160" w:type="dxa"/>
+              <w:left w:w="220" w:type="dxa"/>
+              <w:right w:w="220" w:type="dxa"/>
+            </w:tcMar>
+            <w:tcBorders>
+              <w:top w:val="none"/>
+              <w:left w:val="single" w:sz="30" w:space="0" w:color="0B7285"/>
+              <w:bottom w:val="none"/>
+              <w:right w:val="none"/>
+            </w:tcBorders>
+          </w:tcPr>
+          <w:p>
+            <w:pPr>
+              <w:spacing w:before="0" w:after="80"/>
+            </w:pPr>
+            <w:r>
+              <w:rPr>
+                <w:rFonts w:ascii="Calibri" w:hAnsi="Calibri"/>
+                <w:b/>
+                <w:color w:val="0B7285"/>
+                <w:sz w:val="22"/>
+              </w:rPr>
+              <w:t>🎬 QUÉ HACE NOTEBOOKLM AL PULSAR «RESUMEN DE VÍDEO»</w:t>
+            </w:r>
+          </w:p>
+          <w:p>
+            <w:pPr>
+              <w:spacing w:before="0" w:after="60"/>
+            </w:pPr>
+            <w:r>
+              <w:rPr>
+                <w:rFonts w:ascii="Calibri" w:hAnsi="Calibri"/>
+                <w:color w:val="28323C"/>
+                <w:sz w:val="20"/>
+              </w:rPr>
+              <w:t>1. Lee al mismo tiempo la vivencia íntima del salón madrileño de 1969, la hazaña científica del Saturno V y de Fresnedillas, y la conmemoración de Euronews.</w:t>
+            </w:r>
+          </w:p>
+          <w:p>
+            <w:pPr>
+              <w:spacing w:before="0" w:after="60"/>
+            </w:pPr>
+            <w:r>
+              <w:rPr>
+                <w:rFonts w:ascii="Calibri" w:hAnsi="Calibri"/>
+                <w:color w:val="28323C"/>
+                <w:sz w:val="20"/>
+              </w:rPr>
+              <w:t>2. Estructura una narrativa audiovisual equilibrada que combina imagen, texto y datos clave en un formato dinámico y moderno listo para proyectar.</w:t>
+            </w:r>
+          </w:p>
+        </w:tc>
+      </w:tr>
+    </w:tbl>
     <w:p>
       <w:pPr>
-        <w:spacing w:after="160"/>
-        <w:ind w:left="288"/>
+        <w:spacing w:after="80"/>
       </w:pPr>
-      <w:r>
-        <w:rPr>
-          <w:b/>
-        </w:rPr>
-        <w:t xml:space="preserve">[  ] Paso 4.4: El Gran Podcast Final de las 3 Fuentes: </w:t>
-      </w:r>
-      <w:r>
-        <w:rPr>
-          <w:color w:val="212529"/>
-        </w:rPr>
-        <w:t xml:space="preserve">Vuelve a NotebookLM. En la columna derecha (Studio), pulsa el botón </w:t>
-      </w:r>
-      <w:r>
-        <w:rPr>
-          <w:b/>
-        </w:rPr>
-        <w:t>«Generar» en Resumen de audio</w:t>
-      </w:r>
-      <w:r>
-        <w:t>. Ponte cómodo y escucha la tertulia en español donde los locutores entrelazan el carro de mulas, la estación de Madrid y el aniversario espacial.</w:t>
-      </w:r>
     </w:p>
     <w:p>
       <w:pPr>
@@ -2474,7 +2487,7 @@
                 <w:color w:val="212529"/>
                 <w:sz w:val="18"/>
               </w:rPr>
-              <w:t>Sé localizar y leer el Resumen Automático Central en la Guía del Cuaderno.</w:t>
+              <w:t>Sé localizar y observar el Resumen Automático Central en la Guía del Cuaderno.</w:t>
             </w:r>
           </w:p>
         </w:tc>
@@ -2708,7 +2721,7 @@
                 <w:color w:val="212529"/>
                 <w:sz w:val="18"/>
               </w:rPr>
-              <w:t>Sé fijar cualquier respuesta útil como Nota permanente con la chincheta (Pin).</w:t>
+              <w:t>Sé fijar cualquier respuesta útil como Nota permanente en Studio con la chincheta (Pin).</w:t>
             </w:r>
           </w:p>
         </w:tc>
@@ -2786,7 +2799,7 @@
                 <w:color w:val="212529"/>
                 <w:sz w:val="18"/>
               </w:rPr>
-              <w:t>He probado los 9 botones del panel de Studio con la fuente de YouTube.</w:t>
+              <w:t>He probado los botones automáticos de Studio seleccionando únicamente la fuente de YouTube.</w:t>
             </w:r>
           </w:p>
         </w:tc>
@@ -2864,7 +2877,7 @@
                 <w:color w:val="212529"/>
                 <w:sz w:val="18"/>
               </w:rPr>
-              <w:t>Sé crear una presentación de diapositivas con TXT + PDF y pedirle que la revise.</w:t>
+              <w:t>Sé pulsar el botón Presentación (TXT+PDF) con estilo sobrio y realizar la revisión en vivo.</w:t>
             </w:r>
           </w:p>
         </w:tc>
@@ -2942,7 +2955,7 @@
                 <w:color w:val="212529"/>
                 <w:sz w:val="18"/>
               </w:rPr>
-              <w:t>He combinado las 3 fuentes a la vez para generar un guion, un vídeo y un podcast.</w:t>
+              <w:t>Sé seleccionar las 3 fuentes a la vez y pulsar directamente el botón Resumen de vídeo.</w:t>
             </w:r>
           </w:p>
         </w:tc>

</xml_diff>